<commit_message>
document done besides final run and corrections from that
</commit_message>
<xml_diff>
--- a/HI2459_finalproject-option1-report_jeb382.docx
+++ b/HI2459_finalproject-option1-report_jeb382.docx
@@ -105,7 +105,23 @@
           <w:sz w:val="20"/>
           <w:szCs w:val="20"/>
         </w:rPr>
-        <w:t>caused by the cartiliage in your knee joints breaking down and causing the bones to rub together. This is associated with pain, swelling, and stiffness.</w:t>
+        <w:t xml:space="preserve">caused by the </w:t>
+      </w:r>
+      <w:r>
+        <w:rPr>
+          <w:rFonts w:ascii="Arial" w:hAnsi="Arial" w:cs="Arial"/>
+          <w:sz w:val="20"/>
+          <w:szCs w:val="20"/>
+        </w:rPr>
+        <w:t>cartilage</w:t>
+      </w:r>
+      <w:r>
+        <w:rPr>
+          <w:rFonts w:ascii="Arial" w:hAnsi="Arial" w:cs="Arial"/>
+          <w:sz w:val="20"/>
+          <w:szCs w:val="20"/>
+        </w:rPr>
+        <w:t xml:space="preserve"> in your knee joints breaking down and causing the bones to rub together. This is associated with pain, swelling, and stiffness.</w:t>
       </w:r>
       <w:r>
         <w:rPr>
@@ -168,8 +184,8 @@
         <w:spacing w:line="240" w:lineRule="auto"/>
         <w:rPr>
           <w:rFonts w:ascii="Arial" w:hAnsi="Arial" w:cs="Arial"/>
-          <w:sz w:val="20"/>
-          <w:szCs w:val="20"/>
+          <w:sz w:val="22"/>
+          <w:szCs w:val="22"/>
         </w:rPr>
       </w:pPr>
       <w:r>
@@ -178,59 +194,23 @@
           <w:b/>
           <w:bCs/>
         </w:rPr>
-        <w:t>2.1 Dataset</w:t>
+        <w:t>2.</w:t>
       </w:r>
-      <w:r>
-        <w:rPr>
-          <w:rFonts w:ascii="Arial" w:hAnsi="Arial" w:cs="Arial"/>
-          <w:sz w:val="22"/>
-          <w:szCs w:val="22"/>
-        </w:rPr>
-        <w:br/>
-      </w:r>
-      <w:r>
-        <w:rPr>
-          <w:rFonts w:ascii="Arial" w:hAnsi="Arial" w:cs="Arial"/>
-          <w:sz w:val="20"/>
-          <w:szCs w:val="20"/>
-        </w:rPr>
-        <w:t>[about dataset</w:t>
-      </w:r>
-      <w:r>
-        <w:rPr>
-          <w:rFonts w:ascii="Arial" w:hAnsi="Arial" w:cs="Arial"/>
-          <w:sz w:val="20"/>
-          <w:szCs w:val="20"/>
-        </w:rPr>
-        <w:t>]</w:t>
-      </w:r>
-    </w:p>
-    <w:p>
-      <w:pPr>
-        <w:spacing w:line="240" w:lineRule="auto"/>
-        <w:rPr>
-          <w:rFonts w:ascii="Arial" w:hAnsi="Arial" w:cs="Arial"/>
-          <w:sz w:val="22"/>
-          <w:szCs w:val="22"/>
-        </w:rPr>
-      </w:pPr>
-    </w:p>
-    <w:p>
-      <w:pPr>
-        <w:spacing w:line="240" w:lineRule="auto"/>
-        <w:rPr>
-          <w:rFonts w:ascii="Arial" w:hAnsi="Arial" w:cs="Arial"/>
-          <w:sz w:val="22"/>
-          <w:szCs w:val="22"/>
-        </w:rPr>
-      </w:pPr>
       <w:r>
         <w:rPr>
           <w:rFonts w:ascii="Arial" w:hAnsi="Arial" w:cs="Arial"/>
           <w:b/>
           <w:bCs/>
         </w:rPr>
-        <w:t xml:space="preserve">2.2 </w:t>
+        <w:t>1</w:t>
+      </w:r>
+      <w:r>
+        <w:rPr>
+          <w:rFonts w:ascii="Arial" w:hAnsi="Arial" w:cs="Arial"/>
+          <w:b/>
+          <w:bCs/>
+        </w:rPr>
+        <w:t xml:space="preserve"> </w:t>
       </w:r>
       <w:r>
         <w:rPr>
@@ -435,7 +415,23 @@
           <w:b/>
           <w:bCs/>
         </w:rPr>
-        <w:t xml:space="preserve">2.4 </w:t>
+        <w:t>2.</w:t>
+      </w:r>
+      <w:r>
+        <w:rPr>
+          <w:rFonts w:ascii="Arial" w:hAnsi="Arial" w:cs="Arial"/>
+          <w:b/>
+          <w:bCs/>
+        </w:rPr>
+        <w:t>2</w:t>
+      </w:r>
+      <w:r>
+        <w:rPr>
+          <w:rFonts w:ascii="Arial" w:hAnsi="Arial" w:cs="Arial"/>
+          <w:b/>
+          <w:bCs/>
+        </w:rPr>
+        <w:t xml:space="preserve"> </w:t>
       </w:r>
       <w:r>
         <w:rPr>
@@ -515,7 +511,6 @@
           <w:sz w:val="20"/>
           <w:szCs w:val="20"/>
         </w:rPr>
-        <w:lastRenderedPageBreak/>
         <w:t>Metrics used for evaluation was AUC, accuracy, marco-f1, and for both classes: precision, recall, and f1-score. There was also a generated Confusion Matrix, Loss curve, and ROC-AUC curve.</w:t>
       </w:r>
     </w:p>
@@ -544,6 +539,7 @@
           <w:b/>
           <w:bCs/>
         </w:rPr>
+        <w:lastRenderedPageBreak/>
         <w:t>2.3 Experiments</w:t>
       </w:r>
       <w:r>
@@ -6177,7 +6173,6 @@
           <w:sz w:val="16"/>
           <w:szCs w:val="16"/>
         </w:rPr>
-        <w:lastRenderedPageBreak/>
         <w:t>Table 2.</w:t>
       </w:r>
       <w:r>

</xml_diff>

<commit_message>
powerpoint done outside final run and results, and besides script
</commit_message>
<xml_diff>
--- a/HI2459_finalproject-option1-report_jeb382.docx
+++ b/HI2459_finalproject-option1-report_jeb382.docx
@@ -145,7 +145,25 @@
           <w:sz w:val="20"/>
           <w:szCs w:val="20"/>
         </w:rPr>
-        <w:t xml:space="preserve"> worldwide, impacting 365 million people. Medical professionals are very busy and the evaluation of radiographs are a prime target to use with automated AI tools to decrease the amount of time it takes a medical professional to make their diagnosis.</w:t>
+        <w:t xml:space="preserve"> worldwide, impacting 365 million people. Medical professionals are very </w:t>
+      </w:r>
+      <w:proofErr w:type="gramStart"/>
+      <w:r>
+        <w:rPr>
+          <w:rFonts w:ascii="Arial" w:hAnsi="Arial" w:cs="Arial"/>
+          <w:sz w:val="20"/>
+          <w:szCs w:val="20"/>
+        </w:rPr>
+        <w:t>busy</w:t>
+      </w:r>
+      <w:proofErr w:type="gramEnd"/>
+      <w:r>
+        <w:rPr>
+          <w:rFonts w:ascii="Arial" w:hAnsi="Arial" w:cs="Arial"/>
+          <w:sz w:val="20"/>
+          <w:szCs w:val="20"/>
+        </w:rPr>
+        <w:t xml:space="preserve"> and the evaluation of radiographs are a prime target to use with automated AI tools to decrease the amount of time it takes a medical professional to make their diagnosis.</w:t>
       </w:r>
     </w:p>
     <w:p>
@@ -276,7 +294,15 @@
           <w:sz w:val="20"/>
           <w:szCs w:val="20"/>
         </w:rPr>
-        <w:t>, or rather ViT, is used as a backbone to extract features from out input images. These features are then given to an MLP as a classification head for a binary label decided by a threshold of 0.5 on the confidence percentage that the input image is [----]</w:t>
+        <w:t xml:space="preserve">, or rather ViT, is used as a backbone to extract features from out input images. These features are then given to an MLP as a classification head for a binary label decided by a threshold of 0.5 on the confidence percentage that the input image </w:t>
+      </w:r>
+      <w:r>
+        <w:rPr>
+          <w:rFonts w:ascii="Arial" w:hAnsi="Arial" w:cs="Arial"/>
+          <w:sz w:val="20"/>
+          <w:szCs w:val="20"/>
+        </w:rPr>
+        <w:t>shows Knee Osteoarthritis.</w:t>
       </w:r>
     </w:p>
     <w:p>
@@ -457,7 +483,23 @@
           <w:sz w:val="20"/>
           <w:szCs w:val="20"/>
         </w:rPr>
-        <w:t>The model was trained on a split of training data that is adjusted with a seperate validation split during training, and able to be evaluated with another split of testing data that is unseen. This is open to change as discussed later in capturing certain results. Given a split of 70% training data, the other 30% is split evenly between the validation and testing set.</w:t>
+        <w:t xml:space="preserve">The model was trained on a split of training data that is adjusted with a </w:t>
+      </w:r>
+      <w:r>
+        <w:rPr>
+          <w:rFonts w:ascii="Arial" w:hAnsi="Arial" w:cs="Arial"/>
+          <w:sz w:val="20"/>
+          <w:szCs w:val="20"/>
+        </w:rPr>
+        <w:t>separate</w:t>
+      </w:r>
+      <w:r>
+        <w:rPr>
+          <w:rFonts w:ascii="Arial" w:hAnsi="Arial" w:cs="Arial"/>
+          <w:sz w:val="20"/>
+          <w:szCs w:val="20"/>
+        </w:rPr>
+        <w:t xml:space="preserve"> validation split during training, and able to be evaluated with another split of testing data that is unseen. This is open to change as discussed later in capturing certain results. Given a split of 70% training data, the other 30% is split evenly between the validation and testing set.</w:t>
       </w:r>
     </w:p>
     <w:p>
@@ -475,7 +517,25 @@
           <w:sz w:val="20"/>
           <w:szCs w:val="20"/>
         </w:rPr>
-        <w:t>They were ran on CUDA on a personal PC.</w:t>
+        <w:t xml:space="preserve">They were </w:t>
+      </w:r>
+      <w:proofErr w:type="gramStart"/>
+      <w:r>
+        <w:rPr>
+          <w:rFonts w:ascii="Arial" w:hAnsi="Arial" w:cs="Arial"/>
+          <w:sz w:val="20"/>
+          <w:szCs w:val="20"/>
+        </w:rPr>
+        <w:t>ran</w:t>
+      </w:r>
+      <w:proofErr w:type="gramEnd"/>
+      <w:r>
+        <w:rPr>
+          <w:rFonts w:ascii="Arial" w:hAnsi="Arial" w:cs="Arial"/>
+          <w:sz w:val="20"/>
+          <w:szCs w:val="20"/>
+        </w:rPr>
+        <w:t xml:space="preserve"> on CUDA on a personal PC.</w:t>
       </w:r>
     </w:p>
     <w:p>
@@ -493,7 +553,25 @@
           <w:sz w:val="20"/>
           <w:szCs w:val="20"/>
         </w:rPr>
-        <w:t>It utilized the Cross Entropy Loss function and was optimized with Adam.</w:t>
+        <w:t xml:space="preserve">It utilized the Cross Entropy Loss function and was optimized </w:t>
+      </w:r>
+      <w:proofErr w:type="gramStart"/>
+      <w:r>
+        <w:rPr>
+          <w:rFonts w:ascii="Arial" w:hAnsi="Arial" w:cs="Arial"/>
+          <w:sz w:val="20"/>
+          <w:szCs w:val="20"/>
+        </w:rPr>
+        <w:t>with</w:t>
+      </w:r>
+      <w:proofErr w:type="gramEnd"/>
+      <w:r>
+        <w:rPr>
+          <w:rFonts w:ascii="Arial" w:hAnsi="Arial" w:cs="Arial"/>
+          <w:sz w:val="20"/>
+          <w:szCs w:val="20"/>
+        </w:rPr>
+        <w:t xml:space="preserve"> Adam.</w:t>
       </w:r>
     </w:p>
     <w:p>
@@ -511,7 +589,43 @@
           <w:sz w:val="20"/>
           <w:szCs w:val="20"/>
         </w:rPr>
-        <w:t>Metrics used for evaluation was AUC, accuracy, marco-f1, and for both classes: precision, recall, and f1-score. There was also a generated Confusion Matrix, Loss curve, and ROC-AUC curve.</w:t>
+        <w:t xml:space="preserve">Metrics used for evaluation </w:t>
+      </w:r>
+      <w:proofErr w:type="gramStart"/>
+      <w:r>
+        <w:rPr>
+          <w:rFonts w:ascii="Arial" w:hAnsi="Arial" w:cs="Arial"/>
+          <w:sz w:val="20"/>
+          <w:szCs w:val="20"/>
+        </w:rPr>
+        <w:t>was</w:t>
+      </w:r>
+      <w:proofErr w:type="gramEnd"/>
+      <w:r>
+        <w:rPr>
+          <w:rFonts w:ascii="Arial" w:hAnsi="Arial" w:cs="Arial"/>
+          <w:sz w:val="20"/>
+          <w:szCs w:val="20"/>
+        </w:rPr>
+        <w:t xml:space="preserve"> AUC, accuracy, marco-f1, and for both classes: precision, recall, and f1-score. There </w:t>
+      </w:r>
+      <w:proofErr w:type="gramStart"/>
+      <w:r>
+        <w:rPr>
+          <w:rFonts w:ascii="Arial" w:hAnsi="Arial" w:cs="Arial"/>
+          <w:sz w:val="20"/>
+          <w:szCs w:val="20"/>
+        </w:rPr>
+        <w:t>was</w:t>
+      </w:r>
+      <w:proofErr w:type="gramEnd"/>
+      <w:r>
+        <w:rPr>
+          <w:rFonts w:ascii="Arial" w:hAnsi="Arial" w:cs="Arial"/>
+          <w:sz w:val="20"/>
+          <w:szCs w:val="20"/>
+        </w:rPr>
+        <w:t xml:space="preserve"> also a generated Confusion Matrix, Loss curve, and ROC-AUC curve.</w:t>
       </w:r>
     </w:p>
     <w:p>
@@ -5818,39 +5932,111 @@
           <w:sz w:val="20"/>
           <w:szCs w:val="20"/>
         </w:rPr>
-        <w:t>These metrics were not derived from a unseen testing split; as when the amount of training data increases, there is fewer data to do the evaluation. This result in it being evaluated on very specific cases and will peak at around 70%</w:t>
-      </w:r>
+        <w:t xml:space="preserve">These metrics were not derived from </w:t>
+      </w:r>
+      <w:proofErr w:type="gramStart"/>
       <w:r>
         <w:rPr>
           <w:rFonts w:ascii="Arial" w:hAnsi="Arial" w:cs="Arial"/>
           <w:sz w:val="20"/>
           <w:szCs w:val="20"/>
         </w:rPr>
-        <w:t xml:space="preserve"> </w:t>
-      </w:r>
+        <w:t>a</w:t>
+      </w:r>
+      <w:proofErr w:type="gramEnd"/>
       <w:r>
         <w:rPr>
           <w:rFonts w:ascii="Arial" w:hAnsi="Arial" w:cs="Arial"/>
           <w:sz w:val="20"/>
           <w:szCs w:val="20"/>
         </w:rPr>
-        <w:t xml:space="preserve">before decreasing around </w:t>
-      </w:r>
+        <w:t xml:space="preserve"> unseen testing split; as when the amount of training data increases, there is </w:t>
+      </w:r>
+      <w:proofErr w:type="gramStart"/>
       <w:r>
         <w:rPr>
           <w:rFonts w:ascii="Arial" w:hAnsi="Arial" w:cs="Arial"/>
           <w:sz w:val="20"/>
           <w:szCs w:val="20"/>
         </w:rPr>
-        <w:t xml:space="preserve">the limit of </w:t>
-      </w:r>
+        <w:t>fewer</w:t>
+      </w:r>
+      <w:proofErr w:type="gramEnd"/>
       <w:r>
         <w:rPr>
           <w:rFonts w:ascii="Arial" w:hAnsi="Arial" w:cs="Arial"/>
           <w:sz w:val="20"/>
           <w:szCs w:val="20"/>
         </w:rPr>
-        <w:t xml:space="preserve">100% which </w:t>
+        <w:t xml:space="preserve"> data to do the evaluation. This result in it being evaluated </w:t>
+      </w:r>
+      <w:proofErr w:type="gramStart"/>
+      <w:r>
+        <w:rPr>
+          <w:rFonts w:ascii="Arial" w:hAnsi="Arial" w:cs="Arial"/>
+          <w:sz w:val="20"/>
+          <w:szCs w:val="20"/>
+        </w:rPr>
+        <w:t>on</w:t>
+      </w:r>
+      <w:proofErr w:type="gramEnd"/>
+      <w:r>
+        <w:rPr>
+          <w:rFonts w:ascii="Arial" w:hAnsi="Arial" w:cs="Arial"/>
+          <w:sz w:val="20"/>
+          <w:szCs w:val="20"/>
+        </w:rPr>
+        <w:t xml:space="preserve"> very specific cases and will peak at around 70%</w:t>
+      </w:r>
+      <w:r>
+        <w:rPr>
+          <w:rFonts w:ascii="Arial" w:hAnsi="Arial" w:cs="Arial"/>
+          <w:sz w:val="20"/>
+          <w:szCs w:val="20"/>
+        </w:rPr>
+        <w:t xml:space="preserve"> </w:t>
+      </w:r>
+      <w:r>
+        <w:rPr>
+          <w:rFonts w:ascii="Arial" w:hAnsi="Arial" w:cs="Arial"/>
+          <w:sz w:val="20"/>
+          <w:szCs w:val="20"/>
+        </w:rPr>
+        <w:t xml:space="preserve">before decreasing around </w:t>
+      </w:r>
+      <w:r>
+        <w:rPr>
+          <w:rFonts w:ascii="Arial" w:hAnsi="Arial" w:cs="Arial"/>
+          <w:sz w:val="20"/>
+          <w:szCs w:val="20"/>
+        </w:rPr>
+        <w:t xml:space="preserve">the limit of </w:t>
+      </w:r>
+      <w:r>
+        <w:rPr>
+          <w:rFonts w:ascii="Arial" w:hAnsi="Arial" w:cs="Arial"/>
+          <w:sz w:val="20"/>
+          <w:szCs w:val="20"/>
+        </w:rPr>
+        <w:t>100%</w:t>
+      </w:r>
+      <w:proofErr w:type="gramStart"/>
+      <w:r>
+        <w:rPr>
+          <w:rFonts w:ascii="Arial" w:hAnsi="Arial" w:cs="Arial"/>
+          <w:sz w:val="20"/>
+          <w:szCs w:val="20"/>
+        </w:rPr>
+        <w:t xml:space="preserve"> which</w:t>
+      </w:r>
+      <w:proofErr w:type="gramEnd"/>
+      <w:r>
+        <w:rPr>
+          <w:rFonts w:ascii="Arial" w:hAnsi="Arial" w:cs="Arial"/>
+          <w:sz w:val="20"/>
+          <w:szCs w:val="20"/>
+        </w:rPr>
+        <w:t xml:space="preserve"> </w:t>
       </w:r>
       <w:r>
         <w:rPr>
@@ -5884,23 +6070,59 @@
           <w:sz w:val="20"/>
           <w:szCs w:val="20"/>
         </w:rPr>
-        <w:t>. For this reason we did the</w:t>
-      </w:r>
+        <w:t xml:space="preserve">. For this </w:t>
+      </w:r>
+      <w:proofErr w:type="gramStart"/>
       <w:r>
         <w:rPr>
           <w:rFonts w:ascii="Arial" w:hAnsi="Arial" w:cs="Arial"/>
           <w:sz w:val="20"/>
           <w:szCs w:val="20"/>
         </w:rPr>
-        <w:t xml:space="preserve"> final </w:t>
-      </w:r>
+        <w:t>reason</w:t>
+      </w:r>
+      <w:proofErr w:type="gramEnd"/>
       <w:r>
         <w:rPr>
           <w:rFonts w:ascii="Arial" w:hAnsi="Arial" w:cs="Arial"/>
           <w:sz w:val="20"/>
           <w:szCs w:val="20"/>
         </w:rPr>
-        <w:t>evaluation on the data it was trained on.</w:t>
+        <w:t xml:space="preserve"> we did the</w:t>
+      </w:r>
+      <w:r>
+        <w:rPr>
+          <w:rFonts w:ascii="Arial" w:hAnsi="Arial" w:cs="Arial"/>
+          <w:sz w:val="20"/>
+          <w:szCs w:val="20"/>
+        </w:rPr>
+        <w:t xml:space="preserve"> final </w:t>
+      </w:r>
+      <w:r>
+        <w:rPr>
+          <w:rFonts w:ascii="Arial" w:hAnsi="Arial" w:cs="Arial"/>
+          <w:sz w:val="20"/>
+          <w:szCs w:val="20"/>
+        </w:rPr>
+        <w:t xml:space="preserve">evaluation </w:t>
+      </w:r>
+      <w:proofErr w:type="gramStart"/>
+      <w:r>
+        <w:rPr>
+          <w:rFonts w:ascii="Arial" w:hAnsi="Arial" w:cs="Arial"/>
+          <w:sz w:val="20"/>
+          <w:szCs w:val="20"/>
+        </w:rPr>
+        <w:t>on</w:t>
+      </w:r>
+      <w:proofErr w:type="gramEnd"/>
+      <w:r>
+        <w:rPr>
+          <w:rFonts w:ascii="Arial" w:hAnsi="Arial" w:cs="Arial"/>
+          <w:sz w:val="20"/>
+          <w:szCs w:val="20"/>
+        </w:rPr>
+        <w:t xml:space="preserve"> the data it was trained on.</w:t>
       </w:r>
     </w:p>
     <w:p>
@@ -6016,7 +6238,25 @@
           <w:sz w:val="20"/>
           <w:szCs w:val="20"/>
         </w:rPr>
-        <w:t xml:space="preserve"> Although the performance can be considered comparable in many metrics, especially when there isn’t much to improve with such high scores, finetuning always lead to a higher AUC.</w:t>
+        <w:t xml:space="preserve"> Although the performance can be considered comparable in many metrics, especially when there isn’t much to improve with such high scores, </w:t>
+      </w:r>
+      <w:proofErr w:type="gramStart"/>
+      <w:r>
+        <w:rPr>
+          <w:rFonts w:ascii="Arial" w:hAnsi="Arial" w:cs="Arial"/>
+          <w:sz w:val="20"/>
+          <w:szCs w:val="20"/>
+        </w:rPr>
+        <w:t>finetuning</w:t>
+      </w:r>
+      <w:proofErr w:type="gramEnd"/>
+      <w:r>
+        <w:rPr>
+          <w:rFonts w:ascii="Arial" w:hAnsi="Arial" w:cs="Arial"/>
+          <w:sz w:val="20"/>
+          <w:szCs w:val="20"/>
+        </w:rPr>
+        <w:t xml:space="preserve"> always lead to a higher AUC.</w:t>
       </w:r>
       <w:r>
         <w:rPr>
@@ -17424,7 +17664,43 @@
           <w:sz w:val="20"/>
           <w:szCs w:val="20"/>
         </w:rPr>
-        <w:t>the likelihood of knee osteoarthritis in radiographs using the DinoV2 model. Our results shows that as the amount of data increases, so does the performance and generalizability of our model. We were also able to evaluate the effects of finetuning or freezing the DinoV2 model and were able to achieve an extremely high level of performance.</w:t>
+        <w:t xml:space="preserve">the likelihood of knee osteoarthritis in radiographs using the DinoV2 model. Our results </w:t>
+      </w:r>
+      <w:proofErr w:type="gramStart"/>
+      <w:r>
+        <w:rPr>
+          <w:rFonts w:ascii="Arial" w:hAnsi="Arial" w:cs="Arial"/>
+          <w:sz w:val="20"/>
+          <w:szCs w:val="20"/>
+        </w:rPr>
+        <w:t>shows</w:t>
+      </w:r>
+      <w:proofErr w:type="gramEnd"/>
+      <w:r>
+        <w:rPr>
+          <w:rFonts w:ascii="Arial" w:hAnsi="Arial" w:cs="Arial"/>
+          <w:sz w:val="20"/>
+          <w:szCs w:val="20"/>
+        </w:rPr>
+        <w:t xml:space="preserve"> that as the amount of data increases, so </w:t>
+      </w:r>
+      <w:proofErr w:type="gramStart"/>
+      <w:r>
+        <w:rPr>
+          <w:rFonts w:ascii="Arial" w:hAnsi="Arial" w:cs="Arial"/>
+          <w:sz w:val="20"/>
+          <w:szCs w:val="20"/>
+        </w:rPr>
+        <w:t>does</w:t>
+      </w:r>
+      <w:proofErr w:type="gramEnd"/>
+      <w:r>
+        <w:rPr>
+          <w:rFonts w:ascii="Arial" w:hAnsi="Arial" w:cs="Arial"/>
+          <w:sz w:val="20"/>
+          <w:szCs w:val="20"/>
+        </w:rPr>
+        <w:t xml:space="preserve"> the performance and generalizability of our model. We were also able to evaluate the effects of finetuning or freezing the DinoV2 model and were able to achieve an extremely high level of performance.</w:t>
       </w:r>
     </w:p>
     <w:p>
@@ -17475,12 +17751,117 @@
         </w:rPr>
         <w:tab/>
       </w:r>
+      <w:proofErr w:type="spellStart"/>
       <w:r>
         <w:rPr>
           <w:sz w:val="20"/>
           <w:szCs w:val="20"/>
         </w:rPr>
-        <w:t>Oquab, M., Darcet, T., Moutakanni, T., Vo, H., Szafraniec, M., Khalidov, V., Fernandez, P., Haziza, D., Massa, F., El-Nouby, A., Assran, M., Ballas, N., Galuba, W., Howes, R., Huang, P.-Y., Li, S.-W., Misra, I., Rabbat, M., Sharma, V., &amp; Synnaeve, G. (2023, April 14). </w:t>
+        <w:t>Oquab</w:t>
+      </w:r>
+      <w:proofErr w:type="spellEnd"/>
+      <w:r>
+        <w:rPr>
+          <w:sz w:val="20"/>
+          <w:szCs w:val="20"/>
+        </w:rPr>
+        <w:t xml:space="preserve">, M., </w:t>
+      </w:r>
+      <w:proofErr w:type="spellStart"/>
+      <w:r>
+        <w:rPr>
+          <w:sz w:val="20"/>
+          <w:szCs w:val="20"/>
+        </w:rPr>
+        <w:t>Darcet</w:t>
+      </w:r>
+      <w:proofErr w:type="spellEnd"/>
+      <w:r>
+        <w:rPr>
+          <w:sz w:val="20"/>
+          <w:szCs w:val="20"/>
+        </w:rPr>
+        <w:t xml:space="preserve">, T., </w:t>
+      </w:r>
+      <w:proofErr w:type="spellStart"/>
+      <w:r>
+        <w:rPr>
+          <w:sz w:val="20"/>
+          <w:szCs w:val="20"/>
+        </w:rPr>
+        <w:t>Moutakanni</w:t>
+      </w:r>
+      <w:proofErr w:type="spellEnd"/>
+      <w:r>
+        <w:rPr>
+          <w:sz w:val="20"/>
+          <w:szCs w:val="20"/>
+        </w:rPr>
+        <w:t>, T., Vo, H., Szafraniec, M., Khalidov, V., Fernandez, P., Haziza, D., Massa, F., El-</w:t>
+      </w:r>
+      <w:proofErr w:type="spellStart"/>
+      <w:r>
+        <w:rPr>
+          <w:sz w:val="20"/>
+          <w:szCs w:val="20"/>
+        </w:rPr>
+        <w:t>Nouby</w:t>
+      </w:r>
+      <w:proofErr w:type="spellEnd"/>
+      <w:r>
+        <w:rPr>
+          <w:sz w:val="20"/>
+          <w:szCs w:val="20"/>
+        </w:rPr>
+        <w:t xml:space="preserve">, A., </w:t>
+      </w:r>
+      <w:proofErr w:type="spellStart"/>
+      <w:r>
+        <w:rPr>
+          <w:sz w:val="20"/>
+          <w:szCs w:val="20"/>
+        </w:rPr>
+        <w:t>Assran</w:t>
+      </w:r>
+      <w:proofErr w:type="spellEnd"/>
+      <w:r>
+        <w:rPr>
+          <w:sz w:val="20"/>
+          <w:szCs w:val="20"/>
+        </w:rPr>
+        <w:t xml:space="preserve">, M., Ballas, N., </w:t>
+      </w:r>
+      <w:proofErr w:type="spellStart"/>
+      <w:r>
+        <w:rPr>
+          <w:sz w:val="20"/>
+          <w:szCs w:val="20"/>
+        </w:rPr>
+        <w:t>Galuba</w:t>
+      </w:r>
+      <w:proofErr w:type="spellEnd"/>
+      <w:r>
+        <w:rPr>
+          <w:sz w:val="20"/>
+          <w:szCs w:val="20"/>
+        </w:rPr>
+        <w:t xml:space="preserve">, W., Howes, R., Huang, P.-Y., Li, S.-W., Misra, I., Rabbat, M., Sharma, V., &amp; </w:t>
+      </w:r>
+      <w:proofErr w:type="spellStart"/>
+      <w:r>
+        <w:rPr>
+          <w:sz w:val="20"/>
+          <w:szCs w:val="20"/>
+        </w:rPr>
+        <w:t>Synnaeve</w:t>
+      </w:r>
+      <w:proofErr w:type="spellEnd"/>
+      <w:r>
+        <w:rPr>
+          <w:sz w:val="20"/>
+          <w:szCs w:val="20"/>
+        </w:rPr>
+        <w:t>, G. (2023, April 14). </w:t>
       </w:r>
       <w:r>
         <w:rPr>

</xml_diff>

<commit_message>
include link to github in report
</commit_message>
<xml_diff>
--- a/HI2459_finalproject-option1-report_jeb382.docx
+++ b/HI2459_finalproject-option1-report_jeb382.docx
@@ -129,41 +129,7 @@
           <w:sz w:val="20"/>
           <w:szCs w:val="20"/>
         </w:rPr>
-        <w:t xml:space="preserve"> It is diagnosed by a medical professional evaluating a radiograph of the knee. It affects</w:t>
-      </w:r>
-      <w:r>
-        <w:rPr>
-          <w:rFonts w:ascii="Arial" w:hAnsi="Arial" w:cs="Arial"/>
-          <w:sz w:val="20"/>
-          <w:szCs w:val="20"/>
-        </w:rPr>
-        <w:t xml:space="preserve"> roughly 23% of adults over 40</w:t>
-      </w:r>
-      <w:r>
-        <w:rPr>
-          <w:rFonts w:ascii="Arial" w:hAnsi="Arial" w:cs="Arial"/>
-          <w:sz w:val="20"/>
-          <w:szCs w:val="20"/>
-        </w:rPr>
-        <w:t xml:space="preserve"> worldwide, impacting 365 million people. Medical professionals are very </w:t>
-      </w:r>
-      <w:proofErr w:type="gramStart"/>
-      <w:r>
-        <w:rPr>
-          <w:rFonts w:ascii="Arial" w:hAnsi="Arial" w:cs="Arial"/>
-          <w:sz w:val="20"/>
-          <w:szCs w:val="20"/>
-        </w:rPr>
-        <w:t>busy</w:t>
-      </w:r>
-      <w:proofErr w:type="gramEnd"/>
-      <w:r>
-        <w:rPr>
-          <w:rFonts w:ascii="Arial" w:hAnsi="Arial" w:cs="Arial"/>
-          <w:sz w:val="20"/>
-          <w:szCs w:val="20"/>
-        </w:rPr>
-        <w:t xml:space="preserve"> and the evaluation of radiographs are a prime target to use with automated AI tools to decrease the amount of time it takes a medical professional to make their diagnosis.</w:t>
+        <w:t xml:space="preserve"> It is diagnosed by a medical professional evaluating a radiograph of the knee. It affects roughly 23% of adults over 40 worldwide, impacting 365 million people. Medical professionals are very busy and the evaluation of radiographs are a prime target to use with automated AI tools to decrease the amount of time it takes a medical professional to make their diagnosis.</w:t>
       </w:r>
     </w:p>
     <w:p>
@@ -322,7 +288,7 @@
           <w:szCs w:val="22"/>
         </w:rPr>
         <w:drawing>
-          <wp:inline distT="0" distB="0" distL="0" distR="0" wp14:anchorId="2F21BB5D" wp14:editId="12A5A11C">
+          <wp:inline distT="0" distB="0" distL="0" distR="0" wp14:anchorId="2F21BB5D" wp14:editId="69DD333D">
             <wp:extent cx="5943600" cy="1823646"/>
             <wp:effectExtent l="0" t="0" r="0" b="5715"/>
             <wp:docPr id="1994982975" name="Picture 1"/>
@@ -337,7 +303,7 @@
                     <pic:cNvPicPr/>
                   </pic:nvPicPr>
                   <pic:blipFill>
-                    <a:blip r:embed="rId5" cstate="print">
+                    <a:blip r:embed="rId7" cstate="print">
                       <a:extLst>
                         <a:ext uri="{28A0092B-C50C-407E-A947-70E740481C1C}">
                           <a14:useLocalDpi xmlns:a14="http://schemas.microsoft.com/office/drawing/2010/main" val="0"/>
@@ -517,25 +483,7 @@
           <w:sz w:val="20"/>
           <w:szCs w:val="20"/>
         </w:rPr>
-        <w:t xml:space="preserve">They were </w:t>
-      </w:r>
-      <w:proofErr w:type="gramStart"/>
-      <w:r>
-        <w:rPr>
-          <w:rFonts w:ascii="Arial" w:hAnsi="Arial" w:cs="Arial"/>
-          <w:sz w:val="20"/>
-          <w:szCs w:val="20"/>
-        </w:rPr>
-        <w:t>ran</w:t>
-      </w:r>
-      <w:proofErr w:type="gramEnd"/>
-      <w:r>
-        <w:rPr>
-          <w:rFonts w:ascii="Arial" w:hAnsi="Arial" w:cs="Arial"/>
-          <w:sz w:val="20"/>
-          <w:szCs w:val="20"/>
-        </w:rPr>
-        <w:t xml:space="preserve"> on CUDA on a personal PC.</w:t>
+        <w:t>They were ran on CUDA on a personal PC.</w:t>
       </w:r>
     </w:p>
     <w:p>
@@ -553,25 +501,7 @@
           <w:sz w:val="20"/>
           <w:szCs w:val="20"/>
         </w:rPr>
-        <w:t xml:space="preserve">It utilized the Cross Entropy Loss function and was optimized </w:t>
-      </w:r>
-      <w:proofErr w:type="gramStart"/>
-      <w:r>
-        <w:rPr>
-          <w:rFonts w:ascii="Arial" w:hAnsi="Arial" w:cs="Arial"/>
-          <w:sz w:val="20"/>
-          <w:szCs w:val="20"/>
-        </w:rPr>
-        <w:t>with</w:t>
-      </w:r>
-      <w:proofErr w:type="gramEnd"/>
-      <w:r>
-        <w:rPr>
-          <w:rFonts w:ascii="Arial" w:hAnsi="Arial" w:cs="Arial"/>
-          <w:sz w:val="20"/>
-          <w:szCs w:val="20"/>
-        </w:rPr>
-        <w:t xml:space="preserve"> Adam.</w:t>
+        <w:t>It utilized the Cross Entropy Loss function and was optimized with Adam.</w:t>
       </w:r>
     </w:p>
     <w:p>
@@ -589,43 +519,7 @@
           <w:sz w:val="20"/>
           <w:szCs w:val="20"/>
         </w:rPr>
-        <w:t xml:space="preserve">Metrics used for evaluation </w:t>
-      </w:r>
-      <w:proofErr w:type="gramStart"/>
-      <w:r>
-        <w:rPr>
-          <w:rFonts w:ascii="Arial" w:hAnsi="Arial" w:cs="Arial"/>
-          <w:sz w:val="20"/>
-          <w:szCs w:val="20"/>
-        </w:rPr>
-        <w:t>was</w:t>
-      </w:r>
-      <w:proofErr w:type="gramEnd"/>
-      <w:r>
-        <w:rPr>
-          <w:rFonts w:ascii="Arial" w:hAnsi="Arial" w:cs="Arial"/>
-          <w:sz w:val="20"/>
-          <w:szCs w:val="20"/>
-        </w:rPr>
-        <w:t xml:space="preserve"> AUC, accuracy, marco-f1, and for both classes: precision, recall, and f1-score. There </w:t>
-      </w:r>
-      <w:proofErr w:type="gramStart"/>
-      <w:r>
-        <w:rPr>
-          <w:rFonts w:ascii="Arial" w:hAnsi="Arial" w:cs="Arial"/>
-          <w:sz w:val="20"/>
-          <w:szCs w:val="20"/>
-        </w:rPr>
-        <w:t>was</w:t>
-      </w:r>
-      <w:proofErr w:type="gramEnd"/>
-      <w:r>
-        <w:rPr>
-          <w:rFonts w:ascii="Arial" w:hAnsi="Arial" w:cs="Arial"/>
-          <w:sz w:val="20"/>
-          <w:szCs w:val="20"/>
-        </w:rPr>
-        <w:t xml:space="preserve"> also a generated Confusion Matrix, Loss curve, and ROC-AUC curve.</w:t>
+        <w:t>Metrics used for evaluation was AUC, accuracy, marco-f1, and for both classes: precision, recall, and f1-score. There was also a generated Confusion Matrix, Loss curve, and ROC-AUC curve.</w:t>
       </w:r>
     </w:p>
     <w:p>
@@ -5932,111 +5826,39 @@
           <w:sz w:val="20"/>
           <w:szCs w:val="20"/>
         </w:rPr>
-        <w:t xml:space="preserve">These metrics were not derived from </w:t>
+        <w:t>These metrics were not derived from a unseen testing split; as when the amount of training data increases, there is fewer data to do the evaluation. This result in it being evaluated on very specific cases and will peak at around 70%</w:t>
       </w:r>
-      <w:proofErr w:type="gramStart"/>
       <w:r>
         <w:rPr>
           <w:rFonts w:ascii="Arial" w:hAnsi="Arial" w:cs="Arial"/>
           <w:sz w:val="20"/>
           <w:szCs w:val="20"/>
         </w:rPr>
-        <w:t>a</w:t>
+        <w:t xml:space="preserve"> </w:t>
       </w:r>
-      <w:proofErr w:type="gramEnd"/>
       <w:r>
         <w:rPr>
           <w:rFonts w:ascii="Arial" w:hAnsi="Arial" w:cs="Arial"/>
           <w:sz w:val="20"/>
           <w:szCs w:val="20"/>
         </w:rPr>
-        <w:t xml:space="preserve"> unseen testing split; as when the amount of training data increases, there is </w:t>
+        <w:t xml:space="preserve">before decreasing around </w:t>
       </w:r>
-      <w:proofErr w:type="gramStart"/>
       <w:r>
         <w:rPr>
           <w:rFonts w:ascii="Arial" w:hAnsi="Arial" w:cs="Arial"/>
           <w:sz w:val="20"/>
           <w:szCs w:val="20"/>
         </w:rPr>
-        <w:t>fewer</w:t>
+        <w:t xml:space="preserve">the limit of </w:t>
       </w:r>
-      <w:proofErr w:type="gramEnd"/>
       <w:r>
         <w:rPr>
           <w:rFonts w:ascii="Arial" w:hAnsi="Arial" w:cs="Arial"/>
           <w:sz w:val="20"/>
           <w:szCs w:val="20"/>
         </w:rPr>
-        <w:t xml:space="preserve"> data to do the evaluation. This result in it being evaluated </w:t>
-      </w:r>
-      <w:proofErr w:type="gramStart"/>
-      <w:r>
-        <w:rPr>
-          <w:rFonts w:ascii="Arial" w:hAnsi="Arial" w:cs="Arial"/>
-          <w:sz w:val="20"/>
-          <w:szCs w:val="20"/>
-        </w:rPr>
-        <w:t>on</w:t>
-      </w:r>
-      <w:proofErr w:type="gramEnd"/>
-      <w:r>
-        <w:rPr>
-          <w:rFonts w:ascii="Arial" w:hAnsi="Arial" w:cs="Arial"/>
-          <w:sz w:val="20"/>
-          <w:szCs w:val="20"/>
-        </w:rPr>
-        <w:t xml:space="preserve"> very specific cases and will peak at around 70%</w:t>
-      </w:r>
-      <w:r>
-        <w:rPr>
-          <w:rFonts w:ascii="Arial" w:hAnsi="Arial" w:cs="Arial"/>
-          <w:sz w:val="20"/>
-          <w:szCs w:val="20"/>
-        </w:rPr>
-        <w:t xml:space="preserve"> </w:t>
-      </w:r>
-      <w:r>
-        <w:rPr>
-          <w:rFonts w:ascii="Arial" w:hAnsi="Arial" w:cs="Arial"/>
-          <w:sz w:val="20"/>
-          <w:szCs w:val="20"/>
-        </w:rPr>
-        <w:t xml:space="preserve">before decreasing around </w:t>
-      </w:r>
-      <w:r>
-        <w:rPr>
-          <w:rFonts w:ascii="Arial" w:hAnsi="Arial" w:cs="Arial"/>
-          <w:sz w:val="20"/>
-          <w:szCs w:val="20"/>
-        </w:rPr>
-        <w:t xml:space="preserve">the limit of </w:t>
-      </w:r>
-      <w:r>
-        <w:rPr>
-          <w:rFonts w:ascii="Arial" w:hAnsi="Arial" w:cs="Arial"/>
-          <w:sz w:val="20"/>
-          <w:szCs w:val="20"/>
-        </w:rPr>
-        <w:t>100%</w:t>
-      </w:r>
-      <w:proofErr w:type="gramStart"/>
-      <w:r>
-        <w:rPr>
-          <w:rFonts w:ascii="Arial" w:hAnsi="Arial" w:cs="Arial"/>
-          <w:sz w:val="20"/>
-          <w:szCs w:val="20"/>
-        </w:rPr>
-        <w:t xml:space="preserve"> which</w:t>
-      </w:r>
-      <w:proofErr w:type="gramEnd"/>
-      <w:r>
-        <w:rPr>
-          <w:rFonts w:ascii="Arial" w:hAnsi="Arial" w:cs="Arial"/>
-          <w:sz w:val="20"/>
-          <w:szCs w:val="20"/>
-        </w:rPr>
-        <w:t xml:space="preserve"> </w:t>
+        <w:t xml:space="preserve">100% which </w:t>
       </w:r>
       <w:r>
         <w:rPr>
@@ -6070,59 +5892,23 @@
           <w:sz w:val="20"/>
           <w:szCs w:val="20"/>
         </w:rPr>
-        <w:t xml:space="preserve">. For this </w:t>
+        <w:t>. For this reason we did the</w:t>
       </w:r>
-      <w:proofErr w:type="gramStart"/>
       <w:r>
         <w:rPr>
           <w:rFonts w:ascii="Arial" w:hAnsi="Arial" w:cs="Arial"/>
           <w:sz w:val="20"/>
           <w:szCs w:val="20"/>
         </w:rPr>
-        <w:t>reason</w:t>
+        <w:t xml:space="preserve"> final </w:t>
       </w:r>
-      <w:proofErr w:type="gramEnd"/>
       <w:r>
         <w:rPr>
           <w:rFonts w:ascii="Arial" w:hAnsi="Arial" w:cs="Arial"/>
           <w:sz w:val="20"/>
           <w:szCs w:val="20"/>
         </w:rPr>
-        <w:t xml:space="preserve"> we did the</w:t>
-      </w:r>
-      <w:r>
-        <w:rPr>
-          <w:rFonts w:ascii="Arial" w:hAnsi="Arial" w:cs="Arial"/>
-          <w:sz w:val="20"/>
-          <w:szCs w:val="20"/>
-        </w:rPr>
-        <w:t xml:space="preserve"> final </w:t>
-      </w:r>
-      <w:r>
-        <w:rPr>
-          <w:rFonts w:ascii="Arial" w:hAnsi="Arial" w:cs="Arial"/>
-          <w:sz w:val="20"/>
-          <w:szCs w:val="20"/>
-        </w:rPr>
-        <w:t xml:space="preserve">evaluation </w:t>
-      </w:r>
-      <w:proofErr w:type="gramStart"/>
-      <w:r>
-        <w:rPr>
-          <w:rFonts w:ascii="Arial" w:hAnsi="Arial" w:cs="Arial"/>
-          <w:sz w:val="20"/>
-          <w:szCs w:val="20"/>
-        </w:rPr>
-        <w:t>on</w:t>
-      </w:r>
-      <w:proofErr w:type="gramEnd"/>
-      <w:r>
-        <w:rPr>
-          <w:rFonts w:ascii="Arial" w:hAnsi="Arial" w:cs="Arial"/>
-          <w:sz w:val="20"/>
-          <w:szCs w:val="20"/>
-        </w:rPr>
-        <w:t xml:space="preserve"> the data it was trained on.</w:t>
+        <w:t>evaluation on the data it was trained on.</w:t>
       </w:r>
     </w:p>
     <w:p>
@@ -6238,25 +6024,7 @@
           <w:sz w:val="20"/>
           <w:szCs w:val="20"/>
         </w:rPr>
-        <w:t xml:space="preserve"> Although the performance can be considered comparable in many metrics, especially when there isn’t much to improve with such high scores, </w:t>
-      </w:r>
-      <w:proofErr w:type="gramStart"/>
-      <w:r>
-        <w:rPr>
-          <w:rFonts w:ascii="Arial" w:hAnsi="Arial" w:cs="Arial"/>
-          <w:sz w:val="20"/>
-          <w:szCs w:val="20"/>
-        </w:rPr>
-        <w:t>finetuning</w:t>
-      </w:r>
-      <w:proofErr w:type="gramEnd"/>
-      <w:r>
-        <w:rPr>
-          <w:rFonts w:ascii="Arial" w:hAnsi="Arial" w:cs="Arial"/>
-          <w:sz w:val="20"/>
-          <w:szCs w:val="20"/>
-        </w:rPr>
-        <w:t xml:space="preserve"> always lead to a higher AUC.</w:t>
+        <w:t xml:space="preserve"> Although the performance can be considered comparable in many metrics, especially when there isn’t much to improve with such high scores, finetuning always lead to a higher AUC.</w:t>
       </w:r>
       <w:r>
         <w:rPr>
@@ -17304,7 +17072,7 @@
                     <pic:cNvPicPr/>
                   </pic:nvPicPr>
                   <pic:blipFill>
-                    <a:blip r:embed="rId6">
+                    <a:blip r:embed="rId8">
                       <a:extLst>
                         <a:ext uri="{28A0092B-C50C-407E-A947-70E740481C1C}">
                           <a14:useLocalDpi xmlns:a14="http://schemas.microsoft.com/office/drawing/2010/main" val="0"/>
@@ -17475,7 +17243,7 @@
                     <pic:cNvPicPr/>
                   </pic:nvPicPr>
                   <pic:blipFill>
-                    <a:blip r:embed="rId6">
+                    <a:blip r:embed="rId8">
                       <a:extLst>
                         <a:ext uri="{28A0092B-C50C-407E-A947-70E740481C1C}">
                           <a14:useLocalDpi xmlns:a14="http://schemas.microsoft.com/office/drawing/2010/main" val="0"/>
@@ -17664,43 +17432,7 @@
           <w:sz w:val="20"/>
           <w:szCs w:val="20"/>
         </w:rPr>
-        <w:t xml:space="preserve">the likelihood of knee osteoarthritis in radiographs using the DinoV2 model. Our results </w:t>
-      </w:r>
-      <w:proofErr w:type="gramStart"/>
-      <w:r>
-        <w:rPr>
-          <w:rFonts w:ascii="Arial" w:hAnsi="Arial" w:cs="Arial"/>
-          <w:sz w:val="20"/>
-          <w:szCs w:val="20"/>
-        </w:rPr>
-        <w:t>shows</w:t>
-      </w:r>
-      <w:proofErr w:type="gramEnd"/>
-      <w:r>
-        <w:rPr>
-          <w:rFonts w:ascii="Arial" w:hAnsi="Arial" w:cs="Arial"/>
-          <w:sz w:val="20"/>
-          <w:szCs w:val="20"/>
-        </w:rPr>
-        <w:t xml:space="preserve"> that as the amount of data increases, so </w:t>
-      </w:r>
-      <w:proofErr w:type="gramStart"/>
-      <w:r>
-        <w:rPr>
-          <w:rFonts w:ascii="Arial" w:hAnsi="Arial" w:cs="Arial"/>
-          <w:sz w:val="20"/>
-          <w:szCs w:val="20"/>
-        </w:rPr>
-        <w:t>does</w:t>
-      </w:r>
-      <w:proofErr w:type="gramEnd"/>
-      <w:r>
-        <w:rPr>
-          <w:rFonts w:ascii="Arial" w:hAnsi="Arial" w:cs="Arial"/>
-          <w:sz w:val="20"/>
-          <w:szCs w:val="20"/>
-        </w:rPr>
-        <w:t xml:space="preserve"> the performance and generalizability of our model. We were also able to evaluate the effects of finetuning or freezing the DinoV2 model and were able to achieve an extremely high level of performance.</w:t>
+        <w:t>the likelihood of knee osteoarthritis in radiographs using the DinoV2 model. Our results shows that as the amount of data increases, so does the performance and generalizability of our model. We were also able to evaluate the effects of finetuning or freezing the DinoV2 model and were able to achieve an extremely high level of performance.</w:t>
       </w:r>
     </w:p>
     <w:p>
@@ -17881,13 +17613,146 @@
       </w:r>
     </w:p>
     <w:sectPr>
+      <w:headerReference w:type="even" r:id="rId9"/>
+      <w:headerReference w:type="default" r:id="rId10"/>
+      <w:footerReference w:type="even" r:id="rId11"/>
+      <w:footerReference w:type="default" r:id="rId12"/>
+      <w:headerReference w:type="first" r:id="rId13"/>
+      <w:footerReference w:type="first" r:id="rId14"/>
       <w:pgSz w:w="12240" w:h="15840"/>
       <w:pgMar w:top="1440" w:right="1440" w:bottom="1440" w:left="1440" w:header="720" w:footer="720" w:gutter="0"/>
       <w:cols w:space="720"/>
+      <w:titlePg/>
       <w:docGrid w:linePitch="360"/>
     </w:sectPr>
   </w:body>
 </w:document>
+</file>
+
+<file path=word/endnotes.xml><?xml version="1.0" encoding="utf-8"?>
+<w:endnotes xmlns:wpc="http://schemas.microsoft.com/office/word/2010/wordprocessingCanvas" xmlns:cx="http://schemas.microsoft.com/office/drawing/2014/chartex" xmlns:cx1="http://schemas.microsoft.com/office/drawing/2015/9/8/chartex" xmlns:cx2="http://schemas.microsoft.com/office/drawing/2015/10/21/chartex" xmlns:cx3="http://schemas.microsoft.com/office/drawing/2016/5/9/chartex" xmlns:cx4="http://schemas.microsoft.com/office/drawing/2016/5/10/chartex" xmlns:cx5="http://schemas.microsoft.com/office/drawing/2016/5/11/chartex" xmlns:cx6="http://schemas.microsoft.com/office/drawing/2016/5/12/chartex" xmlns:cx7="http://schemas.microsoft.com/office/drawing/2016/5/13/chartex" xmlns:cx8="http://schemas.microsoft.com/office/drawing/2016/5/14/chartex" xmlns:mc="http://schemas.openxmlformats.org/markup-compatibility/2006" xmlns:aink="http://schemas.microsoft.com/office/drawing/2016/ink" xmlns:am3d="http://schemas.microsoft.com/office/drawing/2017/model3d" xmlns:o="urn:schemas-microsoft-com:office:office" xmlns:oel="http://schemas.microsoft.com/office/2019/extlst" xmlns:r="http://schemas.openxmlformats.org/officeDocument/2006/relationships" xmlns:m="http://schemas.openxmlformats.org/officeDocument/2006/math" xmlns:v="urn:schemas-microsoft-com:vml" xmlns:wp14="http://schemas.microsoft.com/office/word/2010/wordprocessingDrawing" xmlns:wp="http://schemas.openxmlformats.org/drawingml/2006/wordprocessingDrawing" xmlns:w10="urn:schemas-microsoft-com:office:word" xmlns:w="http://schemas.openxmlformats.org/wordprocessingml/2006/main" xmlns:w14="http://schemas.microsoft.com/office/word/2010/wordml" xmlns:w15="http://schemas.microsoft.com/office/word/2012/wordml" xmlns:w16cex="http://schemas.microsoft.com/office/word/2018/wordml/cex" xmlns:w16cid="http://schemas.microsoft.com/office/word/2016/wordml/cid" xmlns:w16="http://schemas.microsoft.com/office/word/2018/wordml" xmlns:w16du="http://schemas.microsoft.com/office/word/2023/wordml/word16du" xmlns:w16sdtdh="http://schemas.microsoft.com/office/word/2020/wordml/sdtdatahash" xmlns:w16sdtfl="http://schemas.microsoft.com/office/word/2024/wordml/sdtformatlock" xmlns:w16se="http://schemas.microsoft.com/office/word/2015/wordml/symex" xmlns:wpg="http://schemas.microsoft.com/office/word/2010/wordprocessingGroup" xmlns:wpi="http://schemas.microsoft.com/office/word/2010/wordprocessingInk" xmlns:wne="http://schemas.microsoft.com/office/word/2006/wordml" xmlns:wps="http://schemas.microsoft.com/office/word/2010/wordprocessingShape" mc:Ignorable="w14 w15 w16se w16cid w16 w16cex w16sdtdh w16sdtfl w16du wp14">
+  <w:endnote w:type="separator" w:id="-1">
+    <w:p>
+      <w:pPr>
+        <w:spacing w:after="0" w:line="240" w:lineRule="auto"/>
+      </w:pPr>
+      <w:r>
+        <w:separator/>
+      </w:r>
+    </w:p>
+  </w:endnote>
+  <w:endnote w:type="continuationSeparator" w:id="0">
+    <w:p>
+      <w:pPr>
+        <w:spacing w:after="0" w:line="240" w:lineRule="auto"/>
+      </w:pPr>
+      <w:r>
+        <w:continuationSeparator/>
+      </w:r>
+    </w:p>
+  </w:endnote>
+</w:endnotes>
+</file>
+
+<file path=word/footer1.xml><?xml version="1.0" encoding="utf-8"?>
+<w:ftr xmlns:wpc="http://schemas.microsoft.com/office/word/2010/wordprocessingCanvas" xmlns:cx="http://schemas.microsoft.com/office/drawing/2014/chartex" xmlns:cx1="http://schemas.microsoft.com/office/drawing/2015/9/8/chartex" xmlns:cx2="http://schemas.microsoft.com/office/drawing/2015/10/21/chartex" xmlns:cx3="http://schemas.microsoft.com/office/drawing/2016/5/9/chartex" xmlns:cx4="http://schemas.microsoft.com/office/drawing/2016/5/10/chartex" xmlns:cx5="http://schemas.microsoft.com/office/drawing/2016/5/11/chartex" xmlns:cx6="http://schemas.microsoft.com/office/drawing/2016/5/12/chartex" xmlns:cx7="http://schemas.microsoft.com/office/drawing/2016/5/13/chartex" xmlns:cx8="http://schemas.microsoft.com/office/drawing/2016/5/14/chartex" xmlns:mc="http://schemas.openxmlformats.org/markup-compatibility/2006" xmlns:aink="http://schemas.microsoft.com/office/drawing/2016/ink" xmlns:am3d="http://schemas.microsoft.com/office/drawing/2017/model3d" xmlns:o="urn:schemas-microsoft-com:office:office" xmlns:oel="http://schemas.microsoft.com/office/2019/extlst" xmlns:r="http://schemas.openxmlformats.org/officeDocument/2006/relationships" xmlns:m="http://schemas.openxmlformats.org/officeDocument/2006/math" xmlns:v="urn:schemas-microsoft-com:vml" xmlns:wp14="http://schemas.microsoft.com/office/word/2010/wordprocessingDrawing" xmlns:wp="http://schemas.openxmlformats.org/drawingml/2006/wordprocessingDrawing" xmlns:w10="urn:schemas-microsoft-com:office:word" xmlns:w="http://schemas.openxmlformats.org/wordprocessingml/2006/main" xmlns:w14="http://schemas.microsoft.com/office/word/2010/wordml" xmlns:w15="http://schemas.microsoft.com/office/word/2012/wordml" xmlns:w16cex="http://schemas.microsoft.com/office/word/2018/wordml/cex" xmlns:w16cid="http://schemas.microsoft.com/office/word/2016/wordml/cid" xmlns:w16="http://schemas.microsoft.com/office/word/2018/wordml" xmlns:w16du="http://schemas.microsoft.com/office/word/2023/wordml/word16du" xmlns:w16sdtdh="http://schemas.microsoft.com/office/word/2020/wordml/sdtdatahash" xmlns:w16sdtfl="http://schemas.microsoft.com/office/word/2024/wordml/sdtformatlock" xmlns:w16se="http://schemas.microsoft.com/office/word/2015/wordml/symex" xmlns:wpg="http://schemas.microsoft.com/office/word/2010/wordprocessingGroup" xmlns:wpi="http://schemas.microsoft.com/office/word/2010/wordprocessingInk" xmlns:wne="http://schemas.microsoft.com/office/word/2006/wordml" xmlns:wps="http://schemas.microsoft.com/office/word/2010/wordprocessingShape" mc:Ignorable="w14 w15 w16se w16cid w16 w16cex w16sdtdh w16sdtfl w16du wp14">
+  <w:p>
+    <w:pPr>
+      <w:pStyle w:val="Footer"/>
+    </w:pPr>
+  </w:p>
+</w:ftr>
+</file>
+
+<file path=word/footer2.xml><?xml version="1.0" encoding="utf-8"?>
+<w:ftr xmlns:wpc="http://schemas.microsoft.com/office/word/2010/wordprocessingCanvas" xmlns:cx="http://schemas.microsoft.com/office/drawing/2014/chartex" xmlns:cx1="http://schemas.microsoft.com/office/drawing/2015/9/8/chartex" xmlns:cx2="http://schemas.microsoft.com/office/drawing/2015/10/21/chartex" xmlns:cx3="http://schemas.microsoft.com/office/drawing/2016/5/9/chartex" xmlns:cx4="http://schemas.microsoft.com/office/drawing/2016/5/10/chartex" xmlns:cx5="http://schemas.microsoft.com/office/drawing/2016/5/11/chartex" xmlns:cx6="http://schemas.microsoft.com/office/drawing/2016/5/12/chartex" xmlns:cx7="http://schemas.microsoft.com/office/drawing/2016/5/13/chartex" xmlns:cx8="http://schemas.microsoft.com/office/drawing/2016/5/14/chartex" xmlns:mc="http://schemas.openxmlformats.org/markup-compatibility/2006" xmlns:aink="http://schemas.microsoft.com/office/drawing/2016/ink" xmlns:am3d="http://schemas.microsoft.com/office/drawing/2017/model3d" xmlns:o="urn:schemas-microsoft-com:office:office" xmlns:oel="http://schemas.microsoft.com/office/2019/extlst" xmlns:r="http://schemas.openxmlformats.org/officeDocument/2006/relationships" xmlns:m="http://schemas.openxmlformats.org/officeDocument/2006/math" xmlns:v="urn:schemas-microsoft-com:vml" xmlns:wp14="http://schemas.microsoft.com/office/word/2010/wordprocessingDrawing" xmlns:wp="http://schemas.openxmlformats.org/drawingml/2006/wordprocessingDrawing" xmlns:w10="urn:schemas-microsoft-com:office:word" xmlns:w="http://schemas.openxmlformats.org/wordprocessingml/2006/main" xmlns:w14="http://schemas.microsoft.com/office/word/2010/wordml" xmlns:w15="http://schemas.microsoft.com/office/word/2012/wordml" xmlns:w16cex="http://schemas.microsoft.com/office/word/2018/wordml/cex" xmlns:w16cid="http://schemas.microsoft.com/office/word/2016/wordml/cid" xmlns:w16="http://schemas.microsoft.com/office/word/2018/wordml" xmlns:w16du="http://schemas.microsoft.com/office/word/2023/wordml/word16du" xmlns:w16sdtdh="http://schemas.microsoft.com/office/word/2020/wordml/sdtdatahash" xmlns:w16sdtfl="http://schemas.microsoft.com/office/word/2024/wordml/sdtformatlock" xmlns:w16se="http://schemas.microsoft.com/office/word/2015/wordml/symex" xmlns:wpg="http://schemas.microsoft.com/office/word/2010/wordprocessingGroup" xmlns:wpi="http://schemas.microsoft.com/office/word/2010/wordprocessingInk" xmlns:wne="http://schemas.microsoft.com/office/word/2006/wordml" xmlns:wps="http://schemas.microsoft.com/office/word/2010/wordprocessingShape" mc:Ignorable="w14 w15 w16se w16cid w16 w16cex w16sdtdh w16sdtfl w16du wp14">
+  <w:p>
+    <w:pPr>
+      <w:pStyle w:val="Footer"/>
+    </w:pPr>
+  </w:p>
+</w:ftr>
+</file>
+
+<file path=word/footer3.xml><?xml version="1.0" encoding="utf-8"?>
+<w:ftr xmlns:wpc="http://schemas.microsoft.com/office/word/2010/wordprocessingCanvas" xmlns:cx="http://schemas.microsoft.com/office/drawing/2014/chartex" xmlns:cx1="http://schemas.microsoft.com/office/drawing/2015/9/8/chartex" xmlns:cx2="http://schemas.microsoft.com/office/drawing/2015/10/21/chartex" xmlns:cx3="http://schemas.microsoft.com/office/drawing/2016/5/9/chartex" xmlns:cx4="http://schemas.microsoft.com/office/drawing/2016/5/10/chartex" xmlns:cx5="http://schemas.microsoft.com/office/drawing/2016/5/11/chartex" xmlns:cx6="http://schemas.microsoft.com/office/drawing/2016/5/12/chartex" xmlns:cx7="http://schemas.microsoft.com/office/drawing/2016/5/13/chartex" xmlns:cx8="http://schemas.microsoft.com/office/drawing/2016/5/14/chartex" xmlns:mc="http://schemas.openxmlformats.org/markup-compatibility/2006" xmlns:aink="http://schemas.microsoft.com/office/drawing/2016/ink" xmlns:am3d="http://schemas.microsoft.com/office/drawing/2017/model3d" xmlns:o="urn:schemas-microsoft-com:office:office" xmlns:oel="http://schemas.microsoft.com/office/2019/extlst" xmlns:r="http://schemas.openxmlformats.org/officeDocument/2006/relationships" xmlns:m="http://schemas.openxmlformats.org/officeDocument/2006/math" xmlns:v="urn:schemas-microsoft-com:vml" xmlns:wp14="http://schemas.microsoft.com/office/word/2010/wordprocessingDrawing" xmlns:wp="http://schemas.openxmlformats.org/drawingml/2006/wordprocessingDrawing" xmlns:w10="urn:schemas-microsoft-com:office:word" xmlns:w="http://schemas.openxmlformats.org/wordprocessingml/2006/main" xmlns:w14="http://schemas.microsoft.com/office/word/2010/wordml" xmlns:w15="http://schemas.microsoft.com/office/word/2012/wordml" xmlns:w16cex="http://schemas.microsoft.com/office/word/2018/wordml/cex" xmlns:w16cid="http://schemas.microsoft.com/office/word/2016/wordml/cid" xmlns:w16="http://schemas.microsoft.com/office/word/2018/wordml" xmlns:w16du="http://schemas.microsoft.com/office/word/2023/wordml/word16du" xmlns:w16sdtdh="http://schemas.microsoft.com/office/word/2020/wordml/sdtdatahash" xmlns:w16sdtfl="http://schemas.microsoft.com/office/word/2024/wordml/sdtformatlock" xmlns:w16se="http://schemas.microsoft.com/office/word/2015/wordml/symex" xmlns:wpg="http://schemas.microsoft.com/office/word/2010/wordprocessingGroup" xmlns:wpi="http://schemas.microsoft.com/office/word/2010/wordprocessingInk" xmlns:wne="http://schemas.microsoft.com/office/word/2006/wordml" xmlns:wps="http://schemas.microsoft.com/office/word/2010/wordprocessingShape" mc:Ignorable="w14 w15 w16se w16cid w16 w16cex w16sdtdh w16sdtfl w16du wp14">
+  <w:p>
+    <w:pPr>
+      <w:pStyle w:val="Footer"/>
+    </w:pPr>
+    <w:hyperlink r:id="rId1" w:history="1">
+      <w:proofErr w:type="spellStart"/>
+      <w:r>
+        <w:rPr>
+          <w:rStyle w:val="Hyperlink"/>
+        </w:rPr>
+        <w:t>Github</w:t>
+      </w:r>
+      <w:proofErr w:type="spellEnd"/>
+      <w:r>
+        <w:rPr>
+          <w:rStyle w:val="Hyperlink"/>
+        </w:rPr>
+        <w:t xml:space="preserve"> Repo of Project</w:t>
+      </w:r>
+    </w:hyperlink>
+  </w:p>
+</w:ftr>
+</file>
+
+<file path=word/footnotes.xml><?xml version="1.0" encoding="utf-8"?>
+<w:footnotes xmlns:wpc="http://schemas.microsoft.com/office/word/2010/wordprocessingCanvas" xmlns:cx="http://schemas.microsoft.com/office/drawing/2014/chartex" xmlns:cx1="http://schemas.microsoft.com/office/drawing/2015/9/8/chartex" xmlns:cx2="http://schemas.microsoft.com/office/drawing/2015/10/21/chartex" xmlns:cx3="http://schemas.microsoft.com/office/drawing/2016/5/9/chartex" xmlns:cx4="http://schemas.microsoft.com/office/drawing/2016/5/10/chartex" xmlns:cx5="http://schemas.microsoft.com/office/drawing/2016/5/11/chartex" xmlns:cx6="http://schemas.microsoft.com/office/drawing/2016/5/12/chartex" xmlns:cx7="http://schemas.microsoft.com/office/drawing/2016/5/13/chartex" xmlns:cx8="http://schemas.microsoft.com/office/drawing/2016/5/14/chartex" xmlns:mc="http://schemas.openxmlformats.org/markup-compatibility/2006" xmlns:aink="http://schemas.microsoft.com/office/drawing/2016/ink" xmlns:am3d="http://schemas.microsoft.com/office/drawing/2017/model3d" xmlns:o="urn:schemas-microsoft-com:office:office" xmlns:oel="http://schemas.microsoft.com/office/2019/extlst" xmlns:r="http://schemas.openxmlformats.org/officeDocument/2006/relationships" xmlns:m="http://schemas.openxmlformats.org/officeDocument/2006/math" xmlns:v="urn:schemas-microsoft-com:vml" xmlns:wp14="http://schemas.microsoft.com/office/word/2010/wordprocessingDrawing" xmlns:wp="http://schemas.openxmlformats.org/drawingml/2006/wordprocessingDrawing" xmlns:w10="urn:schemas-microsoft-com:office:word" xmlns:w="http://schemas.openxmlformats.org/wordprocessingml/2006/main" xmlns:w14="http://schemas.microsoft.com/office/word/2010/wordml" xmlns:w15="http://schemas.microsoft.com/office/word/2012/wordml" xmlns:w16cex="http://schemas.microsoft.com/office/word/2018/wordml/cex" xmlns:w16cid="http://schemas.microsoft.com/office/word/2016/wordml/cid" xmlns:w16="http://schemas.microsoft.com/office/word/2018/wordml" xmlns:w16du="http://schemas.microsoft.com/office/word/2023/wordml/word16du" xmlns:w16sdtdh="http://schemas.microsoft.com/office/word/2020/wordml/sdtdatahash" xmlns:w16sdtfl="http://schemas.microsoft.com/office/word/2024/wordml/sdtformatlock" xmlns:w16se="http://schemas.microsoft.com/office/word/2015/wordml/symex" xmlns:wpg="http://schemas.microsoft.com/office/word/2010/wordprocessingGroup" xmlns:wpi="http://schemas.microsoft.com/office/word/2010/wordprocessingInk" xmlns:wne="http://schemas.microsoft.com/office/word/2006/wordml" xmlns:wps="http://schemas.microsoft.com/office/word/2010/wordprocessingShape" mc:Ignorable="w14 w15 w16se w16cid w16 w16cex w16sdtdh w16sdtfl w16du wp14">
+  <w:footnote w:type="separator" w:id="-1">
+    <w:p>
+      <w:pPr>
+        <w:spacing w:after="0" w:line="240" w:lineRule="auto"/>
+      </w:pPr>
+      <w:r>
+        <w:separator/>
+      </w:r>
+    </w:p>
+  </w:footnote>
+  <w:footnote w:type="continuationSeparator" w:id="0">
+    <w:p>
+      <w:pPr>
+        <w:spacing w:after="0" w:line="240" w:lineRule="auto"/>
+      </w:pPr>
+      <w:r>
+        <w:continuationSeparator/>
+      </w:r>
+    </w:p>
+  </w:footnote>
+</w:footnotes>
+</file>
+
+<file path=word/header1.xml><?xml version="1.0" encoding="utf-8"?>
+<w:hdr xmlns:wpc="http://schemas.microsoft.com/office/word/2010/wordprocessingCanvas" xmlns:cx="http://schemas.microsoft.com/office/drawing/2014/chartex" xmlns:cx1="http://schemas.microsoft.com/office/drawing/2015/9/8/chartex" xmlns:cx2="http://schemas.microsoft.com/office/drawing/2015/10/21/chartex" xmlns:cx3="http://schemas.microsoft.com/office/drawing/2016/5/9/chartex" xmlns:cx4="http://schemas.microsoft.com/office/drawing/2016/5/10/chartex" xmlns:cx5="http://schemas.microsoft.com/office/drawing/2016/5/11/chartex" xmlns:cx6="http://schemas.microsoft.com/office/drawing/2016/5/12/chartex" xmlns:cx7="http://schemas.microsoft.com/office/drawing/2016/5/13/chartex" xmlns:cx8="http://schemas.microsoft.com/office/drawing/2016/5/14/chartex" xmlns:mc="http://schemas.openxmlformats.org/markup-compatibility/2006" xmlns:aink="http://schemas.microsoft.com/office/drawing/2016/ink" xmlns:am3d="http://schemas.microsoft.com/office/drawing/2017/model3d" xmlns:o="urn:schemas-microsoft-com:office:office" xmlns:oel="http://schemas.microsoft.com/office/2019/extlst" xmlns:r="http://schemas.openxmlformats.org/officeDocument/2006/relationships" xmlns:m="http://schemas.openxmlformats.org/officeDocument/2006/math" xmlns:v="urn:schemas-microsoft-com:vml" xmlns:wp14="http://schemas.microsoft.com/office/word/2010/wordprocessingDrawing" xmlns:wp="http://schemas.openxmlformats.org/drawingml/2006/wordprocessingDrawing" xmlns:w10="urn:schemas-microsoft-com:office:word" xmlns:w="http://schemas.openxmlformats.org/wordprocessingml/2006/main" xmlns:w14="http://schemas.microsoft.com/office/word/2010/wordml" xmlns:w15="http://schemas.microsoft.com/office/word/2012/wordml" xmlns:w16cex="http://schemas.microsoft.com/office/word/2018/wordml/cex" xmlns:w16cid="http://schemas.microsoft.com/office/word/2016/wordml/cid" xmlns:w16="http://schemas.microsoft.com/office/word/2018/wordml" xmlns:w16du="http://schemas.microsoft.com/office/word/2023/wordml/word16du" xmlns:w16sdtdh="http://schemas.microsoft.com/office/word/2020/wordml/sdtdatahash" xmlns:w16sdtfl="http://schemas.microsoft.com/office/word/2024/wordml/sdtformatlock" xmlns:w16se="http://schemas.microsoft.com/office/word/2015/wordml/symex" xmlns:wpg="http://schemas.microsoft.com/office/word/2010/wordprocessingGroup" xmlns:wpi="http://schemas.microsoft.com/office/word/2010/wordprocessingInk" xmlns:wne="http://schemas.microsoft.com/office/word/2006/wordml" xmlns:wps="http://schemas.microsoft.com/office/word/2010/wordprocessingShape" mc:Ignorable="w14 w15 w16se w16cid w16 w16cex w16sdtdh w16sdtfl w16du wp14">
+  <w:p>
+    <w:pPr>
+      <w:pStyle w:val="Header"/>
+    </w:pPr>
+  </w:p>
+</w:hdr>
+</file>
+
+<file path=word/header2.xml><?xml version="1.0" encoding="utf-8"?>
+<w:hdr xmlns:wpc="http://schemas.microsoft.com/office/word/2010/wordprocessingCanvas" xmlns:cx="http://schemas.microsoft.com/office/drawing/2014/chartex" xmlns:cx1="http://schemas.microsoft.com/office/drawing/2015/9/8/chartex" xmlns:cx2="http://schemas.microsoft.com/office/drawing/2015/10/21/chartex" xmlns:cx3="http://schemas.microsoft.com/office/drawing/2016/5/9/chartex" xmlns:cx4="http://schemas.microsoft.com/office/drawing/2016/5/10/chartex" xmlns:cx5="http://schemas.microsoft.com/office/drawing/2016/5/11/chartex" xmlns:cx6="http://schemas.microsoft.com/office/drawing/2016/5/12/chartex" xmlns:cx7="http://schemas.microsoft.com/office/drawing/2016/5/13/chartex" xmlns:cx8="http://schemas.microsoft.com/office/drawing/2016/5/14/chartex" xmlns:mc="http://schemas.openxmlformats.org/markup-compatibility/2006" xmlns:aink="http://schemas.microsoft.com/office/drawing/2016/ink" xmlns:am3d="http://schemas.microsoft.com/office/drawing/2017/model3d" xmlns:o="urn:schemas-microsoft-com:office:office" xmlns:oel="http://schemas.microsoft.com/office/2019/extlst" xmlns:r="http://schemas.openxmlformats.org/officeDocument/2006/relationships" xmlns:m="http://schemas.openxmlformats.org/officeDocument/2006/math" xmlns:v="urn:schemas-microsoft-com:vml" xmlns:wp14="http://schemas.microsoft.com/office/word/2010/wordprocessingDrawing" xmlns:wp="http://schemas.openxmlformats.org/drawingml/2006/wordprocessingDrawing" xmlns:w10="urn:schemas-microsoft-com:office:word" xmlns:w="http://schemas.openxmlformats.org/wordprocessingml/2006/main" xmlns:w14="http://schemas.microsoft.com/office/word/2010/wordml" xmlns:w15="http://schemas.microsoft.com/office/word/2012/wordml" xmlns:w16cex="http://schemas.microsoft.com/office/word/2018/wordml/cex" xmlns:w16cid="http://schemas.microsoft.com/office/word/2016/wordml/cid" xmlns:w16="http://schemas.microsoft.com/office/word/2018/wordml" xmlns:w16du="http://schemas.microsoft.com/office/word/2023/wordml/word16du" xmlns:w16sdtdh="http://schemas.microsoft.com/office/word/2020/wordml/sdtdatahash" xmlns:w16sdtfl="http://schemas.microsoft.com/office/word/2024/wordml/sdtformatlock" xmlns:w16se="http://schemas.microsoft.com/office/word/2015/wordml/symex" xmlns:wpg="http://schemas.microsoft.com/office/word/2010/wordprocessingGroup" xmlns:wpi="http://schemas.microsoft.com/office/word/2010/wordprocessingInk" xmlns:wne="http://schemas.microsoft.com/office/word/2006/wordml" xmlns:wps="http://schemas.microsoft.com/office/word/2010/wordprocessingShape" mc:Ignorable="w14 w15 w16se w16cid w16 w16cex w16sdtdh w16sdtfl w16du wp14">
+  <w:p>
+    <w:pPr>
+      <w:pStyle w:val="Header"/>
+    </w:pPr>
+  </w:p>
+</w:hdr>
+</file>
+
+<file path=word/header3.xml><?xml version="1.0" encoding="utf-8"?>
+<w:hdr xmlns:wpc="http://schemas.microsoft.com/office/word/2010/wordprocessingCanvas" xmlns:cx="http://schemas.microsoft.com/office/drawing/2014/chartex" xmlns:cx1="http://schemas.microsoft.com/office/drawing/2015/9/8/chartex" xmlns:cx2="http://schemas.microsoft.com/office/drawing/2015/10/21/chartex" xmlns:cx3="http://schemas.microsoft.com/office/drawing/2016/5/9/chartex" xmlns:cx4="http://schemas.microsoft.com/office/drawing/2016/5/10/chartex" xmlns:cx5="http://schemas.microsoft.com/office/drawing/2016/5/11/chartex" xmlns:cx6="http://schemas.microsoft.com/office/drawing/2016/5/12/chartex" xmlns:cx7="http://schemas.microsoft.com/office/drawing/2016/5/13/chartex" xmlns:cx8="http://schemas.microsoft.com/office/drawing/2016/5/14/chartex" xmlns:mc="http://schemas.openxmlformats.org/markup-compatibility/2006" xmlns:aink="http://schemas.microsoft.com/office/drawing/2016/ink" xmlns:am3d="http://schemas.microsoft.com/office/drawing/2017/model3d" xmlns:o="urn:schemas-microsoft-com:office:office" xmlns:oel="http://schemas.microsoft.com/office/2019/extlst" xmlns:r="http://schemas.openxmlformats.org/officeDocument/2006/relationships" xmlns:m="http://schemas.openxmlformats.org/officeDocument/2006/math" xmlns:v="urn:schemas-microsoft-com:vml" xmlns:wp14="http://schemas.microsoft.com/office/word/2010/wordprocessingDrawing" xmlns:wp="http://schemas.openxmlformats.org/drawingml/2006/wordprocessingDrawing" xmlns:w10="urn:schemas-microsoft-com:office:word" xmlns:w="http://schemas.openxmlformats.org/wordprocessingml/2006/main" xmlns:w14="http://schemas.microsoft.com/office/word/2010/wordml" xmlns:w15="http://schemas.microsoft.com/office/word/2012/wordml" xmlns:w16cex="http://schemas.microsoft.com/office/word/2018/wordml/cex" xmlns:w16cid="http://schemas.microsoft.com/office/word/2016/wordml/cid" xmlns:w16="http://schemas.microsoft.com/office/word/2018/wordml" xmlns:w16du="http://schemas.microsoft.com/office/word/2023/wordml/word16du" xmlns:w16sdtdh="http://schemas.microsoft.com/office/word/2020/wordml/sdtdatahash" xmlns:w16sdtfl="http://schemas.microsoft.com/office/word/2024/wordml/sdtformatlock" xmlns:w16se="http://schemas.microsoft.com/office/word/2015/wordml/symex" xmlns:wpg="http://schemas.microsoft.com/office/word/2010/wordprocessingGroup" xmlns:wpi="http://schemas.microsoft.com/office/word/2010/wordprocessingInk" xmlns:wne="http://schemas.microsoft.com/office/word/2006/wordml" xmlns:wps="http://schemas.microsoft.com/office/word/2010/wordprocessingShape" mc:Ignorable="w14 w15 w16se w16cid w16 w16cex w16sdtdh w16sdtfl w16du wp14">
+  <w:p>
+    <w:pPr>
+      <w:pStyle w:val="Header"/>
+    </w:pPr>
+  </w:p>
+</w:hdr>
 </file>
 
 <file path=word/numbering.xml><?xml version="1.0" encoding="utf-8"?>
@@ -18598,6 +18463,7 @@
   <w:style w:type="character" w:default="1" w:styleId="DefaultParagraphFont">
     <w:name w:val="Default Paragraph Font"/>
     <w:uiPriority w:val="1"/>
+    <w:semiHidden/>
     <w:unhideWhenUsed/>
   </w:style>
   <w:style w:type="table" w:default="1" w:styleId="TableNormal">
@@ -18951,6 +18817,73 @@
       <w:rFonts w:ascii="Times New Roman" w:hAnsi="Times New Roman" w:cs="Times New Roman"/>
     </w:rPr>
   </w:style>
+  <w:style w:type="paragraph" w:styleId="Header">
+    <w:name w:val="header"/>
+    <w:basedOn w:val="Normal"/>
+    <w:link w:val="HeaderChar"/>
+    <w:uiPriority w:val="99"/>
+    <w:unhideWhenUsed/>
+    <w:rsid w:val="00517EBB"/>
+    <w:pPr>
+      <w:tabs>
+        <w:tab w:val="center" w:pos="4680"/>
+        <w:tab w:val="right" w:pos="9360"/>
+      </w:tabs>
+      <w:spacing w:after="0" w:line="240" w:lineRule="auto"/>
+    </w:pPr>
+  </w:style>
+  <w:style w:type="character" w:customStyle="1" w:styleId="HeaderChar">
+    <w:name w:val="Header Char"/>
+    <w:basedOn w:val="DefaultParagraphFont"/>
+    <w:link w:val="Header"/>
+    <w:uiPriority w:val="99"/>
+    <w:rsid w:val="00517EBB"/>
+  </w:style>
+  <w:style w:type="paragraph" w:styleId="Footer">
+    <w:name w:val="footer"/>
+    <w:basedOn w:val="Normal"/>
+    <w:link w:val="FooterChar"/>
+    <w:uiPriority w:val="99"/>
+    <w:unhideWhenUsed/>
+    <w:rsid w:val="00517EBB"/>
+    <w:pPr>
+      <w:tabs>
+        <w:tab w:val="center" w:pos="4680"/>
+        <w:tab w:val="right" w:pos="9360"/>
+      </w:tabs>
+      <w:spacing w:after="0" w:line="240" w:lineRule="auto"/>
+    </w:pPr>
+  </w:style>
+  <w:style w:type="character" w:customStyle="1" w:styleId="FooterChar">
+    <w:name w:val="Footer Char"/>
+    <w:basedOn w:val="DefaultParagraphFont"/>
+    <w:link w:val="Footer"/>
+    <w:uiPriority w:val="99"/>
+    <w:rsid w:val="00517EBB"/>
+  </w:style>
+  <w:style w:type="character" w:styleId="Hyperlink">
+    <w:name w:val="Hyperlink"/>
+    <w:basedOn w:val="DefaultParagraphFont"/>
+    <w:uiPriority w:val="99"/>
+    <w:unhideWhenUsed/>
+    <w:rsid w:val="00517EBB"/>
+    <w:rPr>
+      <w:color w:val="467886" w:themeColor="hyperlink"/>
+      <w:u w:val="single"/>
+    </w:rPr>
+  </w:style>
+  <w:style w:type="character" w:styleId="UnresolvedMention">
+    <w:name w:val="Unresolved Mention"/>
+    <w:basedOn w:val="DefaultParagraphFont"/>
+    <w:uiPriority w:val="99"/>
+    <w:semiHidden/>
+    <w:unhideWhenUsed/>
+    <w:rsid w:val="00517EBB"/>
+    <w:rPr>
+      <w:color w:val="605E5C"/>
+      <w:shd w:val="clear" w:color="auto" w:fill="E1DFDD"/>
+    </w:rPr>
+  </w:style>
 </w:styles>
 </file>
 

</xml_diff>